<commit_message>
Match original PDF pagination: same 11 pages, column starts/ends and figure positions
Co-Authored-By: Claude Opus 5.5 <noreply@anthropic.com>
Claude-Session: https://claude.ai/code/session_01NDT9onG1kgpDJKitApgfM4
</commit_message>
<xml_diff>
--- a/paper/Freelance3_IEEE_Conference.docx
+++ b/paper/Freelance3_IEEE_Conference.docx
@@ -513,17 +513,16 @@
     <w:p>
       <w:pPr>
         <w:pStyle w:val="Author"/>
-        <w:spacing w:before="5pt" w:beforeAutospacing="1" w:after="5pt" w:afterAutospacing="1" w:line="12pt" w:lineRule="auto"/>
+        <w:spacing w:before="0pt" w:after="6pt"/>
         <w:rPr>
           <w:sz w:val="16"/>
           <w:szCs w:val="16"/>
         </w:rPr>
         <w:sectPr>
-          <w:footerReference w:type="first" r:id="rId8"/>
+          <w:type w:val="nextPage"/>
           <w:pgSz w:w="595.30pt" w:h="841.90pt" w:code="9"/>
           <w:pgMar w:top="27pt" w:right="44.65pt" w:bottom="72pt" w:left="44.65pt" w:header="36pt" w:footer="36pt" w:gutter="0pt"/>
-          <w:cols w:space="36pt"/>
-          <w:titlePg/>
+          <w:cols w:space="18pt"/>
           <w:docGrid w:linePitch="360"/>
         </w:sectPr>
       </w:pPr>
@@ -575,15 +574,19 @@
         <w:pStyle w:val="BodyText"/>
       </w:pPr>
       <w:r>
-        <w:t>Through centralised systems that handle identity, job postings, communication, reputation, and payments, digital freelance platforms usually facilitate client-worker coordination. Coordination is made easier by this centralisation, but control over user information and marketplace regulations is concentrated in the hands of one middleman. Platform-specific ratings, self-reported profiles, or portfolio content are typically used to depict a freelancer’s work history; this information is hard to transfer between platforms and does not provide independently verified proof of a claimed skill. An alternate basis for documenting specific marketplace occurrences and using smart contracts to enforce settlement requirements is provided by blockchain technology; the broader security and decentralization literature also frames blockchain as a system for reducing dependence on trusted intermediaries [23]. However, the fundamental trust issue cannot be solved by merely moving a freelance marketplace onto a blockchain.</w:t>
+        <w:t>Through centralised systems that handle identity, job postings, communication, reputation, and payments, digital freelance platforms usually facilitate client-worker coordination.</w:t>
       </w:r>
     </w:p>
     <w:p>
       <w:pPr>
         <w:pStyle w:val="BodyText"/>
-      </w:pPr>
-      <w:r>
-        <w:t>A blockchain can record the issuance of a credential, but it cannot independently confirm that the underlying skill claim was correctly evaluated. Privacy-oriented blockchain architectures likewise emphasize keeping sensitive application data under user control rather than exposing raw records on a public ledger [24]. Similarly, releasing reputation data on-chain can increase openness while also revealing private commercial and behavioural data on clients and independent contractors. AI-based services can help with risk prediction and skill evaluation, but their outputs raise new issues with accountability, repeatability, and oracle trust that are not addressed by a strictly on-chain design. A hybrid design, in which the blockchain serves as a settlement and verification layer and carefully scoped off-chain components with clear trust boundaries handle assessment, evidence creation, and analytics, is motivated by these conflicts.</w:t>
+        <w:ind w:firstLine="0pt"/>
+      </w:pPr>
+      <w:r>
+        <w:br w:type="column"/>
+      </w:r>
+      <w:r>
+        <w:t>Coordination is made easier by this centralisation, but control over user information and marketplace regulations is concentrated in the hands of one middleman. Platform-specific ratings, self-reported profiles, or portfolio content are typically used to depict a freelancer’s work history; this information is hard to transfer between platforms and does not provide independently verified proof of a claimed skill. An alternate basis for documenting specific marketplace occurrences and using smart contracts to enforce settlement requirements is provided by blockchain technology; the broader security and decentralization literature also frames blockchain as a system for reducing dependence on trusted intermediaries [23]. However, the fundamental trust issue cannot be solved by merely moving a freelance marketplace onto a blockchain.</w:t>
       </w:r>
     </w:p>
     <w:p>
@@ -591,6 +594,26 @@
         <w:pStyle w:val="BodyText"/>
       </w:pPr>
       <w:r>
+        <w:t>A blockchain can record the issuance of a credential, but it cannot independently confirm that the underlying skill claim was correctly evaluated. Privacy-oriented blockchain architectures likewise emphasize keeping sensitive application data under user control rather than exposing raw records on a public ledger [24]. Similarly, releasing reputation data on-chain can increase openness while also revealing private commercial and behavioural data on clients and independent contractors. AI-based services can help with risk prediction and skill evaluation, but their outputs raise new issues with accountability, repeatability, and oracle trust that are not addressed by a strictly on-chain design. A hybrid design, in which the blockchain serves as a settlement and verification</w:t>
+      </w:r>
+    </w:p>
+    <w:p>
+      <w:pPr>
+        <w:pStyle w:val="BodyText"/>
+        <w:ind w:firstLine="0pt"/>
+      </w:pPr>
+      <w:r>
+        <w:br w:type="column"/>
+      </w:r>
+      <w:r>
+        <w:t>layer and carefully scoped off-chain components with clear trust boundaries handle assessment, evidence creation, and analytics, is motivated by these conflicts.</w:t>
+      </w:r>
+    </w:p>
+    <w:p>
+      <w:pPr>
+        <w:pStyle w:val="BodyText"/>
+      </w:pPr>
+      <w:r>
         <w:t>Freelance3, a hybrid architecture built around these limitations, is presented in this paper. While AI-assisted evaluation, zero-knowledge proof creation, and graph analytics operate off-chain under clear trust boundaries, the blockchain acts as a settlement and verification layer. Four related services are supported by the architecture: skill-market relationship analysis via a decentralised skill graph, escrow-based settlement with defined state transitions, privacy-preserving reputation eligibility proofs, and skill verification connected to non-transferable credential issuance. Freelance3 seeks to maintain verifiability and auditability without imposing unfeasible computational or financial costs on-chain by isolating computationally demanding processing from immutable, security-critical actions.</w:t>
       </w:r>
     </w:p>
@@ -671,7 +694,19 @@
         <w:pStyle w:val="BodyText"/>
       </w:pPr>
       <w:r>
-        <w:t>The remainder of this paper is organized as follows. Section II reviews related work across decentralized labor markets, verifiable credentials, zero-knowledge reputation, and on-chain graph analysis. Section III presents the system model and trust boundaries. Section IV details the four-layer architecture. Section V describes the implementation and methodology. Section VI presents the evaluation metrics and results. Section VII discusses security, privacy, and limitations. Section VIII concludes.</w:t>
+        <w:t>The remainder of this paper is organized as follows. Section II reviews related work across decentralized labor markets, verifiable credentials, zero-knowledge reputation, and on-chain graph analysis. Section III presents the system model and trust boundaries. Section IV details the four-layer architecture. Section V describes the implementation and methodology. Section VI presents the evaluation metrics and results. Section</w:t>
+      </w:r>
+    </w:p>
+    <w:p>
+      <w:pPr>
+        <w:pStyle w:val="BodyText"/>
+        <w:ind w:firstLine="0pt"/>
+      </w:pPr>
+      <w:r>
+        <w:br w:type="column"/>
+      </w:r>
+      <w:r>
+        <w:t>VII discusses security, privacy, and limitations. Section VIII concludes.</w:t>
       </w:r>
     </w:p>
     <w:p>
@@ -727,7 +762,19 @@
         <w:pStyle w:val="BodyText"/>
       </w:pPr>
       <w:r>
-        <w:t>The conflict between reputation transparency and privacy is addressed by zero-knowledge proofs, and earlier systems have used ZK-SNARK constructs; foundational privacy systems such as Zerocoin illustrate how public-ledger applications can use cryptographic proofs to reduce information disclosure [25]. (such as Groth16 and PLONK) to create anonymous reputation schemes [7], [8]. However, these efforts are primarily focused on straightforward, single-value transactional ratings like e-commerce feedback, and they either fail to calculate or ignore multi-dimensional behavioural inputs that are necessary to represent long-term service relationships, such as response time, on-time delivery rate, revision frequency, and communication sentiment [9]. Richer inputs are addressed by other suggested multimodal ZK techniques, but the proof-generation costs are too high for a responsive, user-facing platform [10]–[13]. A circuit across several aggregated behavioural inputs intended for useful off-chain evidence production with on-chain verification is the middle ground that this study aims to achieve.</w:t>
+        <w:t>The conflict between reputation transparency and privacy is addressed by zero-knowledge proofs, and earlier systems have used ZK-SNARK constructs; foundational privacy systems such as Zerocoin illustrate how public-ledger applications can use cryptographic proofs to reduce information disclosure [25]. (such as Groth16 and PLONK) to create anonymous reputation schemes [7], [8]. However, these efforts are primarily focused on straightforward, single-value transactional ratings like e-commerce feedback, and they either fail to calculate or ignore multi-dimensional behavioural inputs that are necessary to represent long-term service relationships, such as response time, on-time delivery rate, revision frequency, and communication sentiment [9]. Richer inputs are addressed by other suggested multimodal ZK techniques, but the proof-generation</w:t>
+      </w:r>
+    </w:p>
+    <w:p>
+      <w:pPr>
+        <w:pStyle w:val="BodyText"/>
+        <w:ind w:firstLine="0pt"/>
+      </w:pPr>
+      <w:r>
+        <w:br w:type="column"/>
+      </w:r>
+      <w:r>
+        <w:t>costs are too high for a responsive, user-facing platform [10]–[13]. A circuit across several aggregated behavioural inputs intended for useful off-chain evidence production with on-chain verification is the middle ground that this study aims to achieve.</w:t>
       </w:r>
     </w:p>
     <w:p>
@@ -783,7 +830,19 @@
         <w:pStyle w:val="BodyText"/>
       </w:pPr>
       <w:r>
-        <w:t>Actors that are trustworthy, semi-trusted, and untrusted are distinguished by the design. Smart contracts are regarded as publicly auditable and trustless. The AI Oracle service is a permissioned, semi-trusted component. Since it is the only one authorised to initiate credential minting, its accuracy directly impacts credential integrity, but its choices can still be audited using the deterministic pass/fail challenge outcome. The approach ensures that the on-chain verifier accepts only valid proofs, independent of prover behaviour. The ZK Prover is supposed to be honest but untrusted; it receives private behavioural inputs off-chain. Even if the on-chain state is examined by the public, no private information is revealed because the Reputation Registry contract only keeps verification keys and never raw behavioural data.</w:t>
+        <w:t>Actors that are trustworthy, semi-trusted, and untrusted are distinguished by the design. Smart contracts are regarded as publicly auditable and trustless. The AI Oracle service is a permissioned, semi-trusted component. Since it is the only one authorised to initiate credential minting, its accuracy directly impacts credential integrity, but its choices can still</w:t>
+      </w:r>
+    </w:p>
+    <w:p>
+      <w:pPr>
+        <w:pStyle w:val="BodyText"/>
+        <w:ind w:firstLine="0pt"/>
+      </w:pPr>
+      <w:r>
+        <w:br w:type="column"/>
+      </w:r>
+      <w:r>
+        <w:t>be audited using the deterministic pass/fail challenge outcome. The approach ensures that the on-chain verifier accepts only valid proofs, independent of prover behaviour. The ZK Prover is supposed to be honest but untrusted; it receives private behavioural inputs off-chain. Even if the on-chain state is examined by the public, no private information is revealed because the Reputation Registry contract only keeps verification keys and never raw behavioural data.</w:t>
       </w:r>
     </w:p>
     <w:p>
@@ -845,6 +904,7 @@
       <w:pPr>
         <w:pStyle w:val="tablehead"/>
         <w:keepNext/>
+        <w:spacing w:before="0pt"/>
       </w:pPr>
       <w:r>
         <w:t>Related Work: Research Gaps and Freelance3 Response</w:t>
@@ -1120,7 +1180,7 @@
       <w:pPr>
         <w:spacing w:after="6pt" w:line="6pt" w:lineRule="exact"/>
         <w:sectPr>
-          <w:type w:val="continuous"/>
+          <w:type w:val="nextPage"/>
           <w:pgSz w:w="595.30pt" w:h="841.90pt" w:code="9"/>
           <w:pgMar w:top="54pt" w:right="45.35pt" w:bottom="72pt" w:left="45.35pt" w:header="36pt" w:footer="36pt" w:gutter="0pt"/>
           <w:cols w:space="18pt"/>
@@ -1180,6 +1240,9 @@
       <w:pPr>
         <w:spacing w:after="0pt" w:line="6pt" w:lineRule="exact"/>
       </w:pPr>
+      <w:r>
+        <w:br w:type="column"/>
+      </w:r>
     </w:p>
     <w:tbl>
       <w:tblPr>
@@ -1504,7 +1567,7 @@
         </w:sectPr>
       </w:pPr>
       <w:r>
-        <w:t>For a requested expertise, a freelancer starts a front-end skill evaluation. Algorithm 2 specifies the skill-verification and credential-minting procedure, and Fig. 2 presents its sequence flow. This request is sent by the backend to the AI Oracle, which, instead of using a static question bank – the primary anti-cheat mechanism – generates a random, unpredictable technological challenge. The solution that the freelancer produced is sent back to the backend and sent to Oracle for automatic assessment in accordance with predetermined standards. When a verdict is passed, the backend – which is the authorised minter – invokes the mint function of the SBT contract and issues a non-transferable credential that is linked to the freelancer’s wallet. Instead, a fail verdict prevents brute-force resubmission by enforcing a cooling interval prior to the subsequent attempt.</w:t>
+        <w:t>For a requested expertise, a freelancer starts a front-end skill evaluation. Algorithm 2 specifies the skill-verification and credential-minting procedure, and Fig. 2 presents its sequence</w:t>
       </w:r>
     </w:p>
     <w:p>
@@ -1516,7 +1579,7 @@
       <w:r>
         <w:drawing>
           <wp:inline distT="0" distB="0" distL="0" distR="0">
-            <wp:extent cx="4572000" cy="4432244"/>
+            <wp:extent cx="5842000" cy="5663423"/>
             <wp:docPr id="1" name="Picture 1"/>
             <wp:cNvGraphicFramePr>
               <a:graphicFrameLocks xmlns:a="http://purl.oclc.org/ooxml/drawingml/main" noChangeAspect="1"/>
@@ -1537,7 +1600,7 @@
                   <pic:spPr>
                     <a:xfrm>
                       <a:off x="0" y="0"/>
-                      <a:ext cx="4572000" cy="4432244"/>
+                      <a:ext cx="5842000" cy="5663423"/>
                     </a:xfrm>
                     <a:prstGeom prst="rect">
                       <a:avLst/>
@@ -1555,7 +1618,7 @@
         <w:pStyle w:val="figurecaption"/>
         <w:jc w:val="center"/>
         <w:sectPr>
-          <w:type w:val="continuous"/>
+          <w:type w:val="nextPage"/>
           <w:pgSz w:w="595.30pt" w:h="841.90pt" w:code="9"/>
           <w:pgMar w:top="54pt" w:right="45.35pt" w:bottom="72pt" w:left="45.35pt" w:header="36pt" w:footer="36pt" w:gutter="0pt"/>
           <w:cols w:space="18pt"/>
@@ -1568,8 +1631,20 @@
     </w:p>
     <w:p>
       <w:pPr>
+        <w:pStyle w:val="BodyText"/>
+        <w:ind w:firstLine="0pt"/>
+      </w:pPr>
+      <w:r>
+        <w:t>flow. This request is sent by the backend to the AI Oracle, which, instead of using a static question bank – the primary anti-cheat mechanism – generates a random, unpredictable technological challenge. The solution that the freelancer produced is sent back to the backend and sent to Oracle for automatic assessment in accordance with predetermined standards. When a verdict is passed, the backend – which is the authorised minter – invokes the mint function of the SBT contract and issues a non-transferable credential that is linked to the freelancer’s wallet. Instead, a fail verdict prevents brute-force resubmission by enforcing a cooling interval prior to the subsequent attempt.</w:t>
+      </w:r>
+    </w:p>
+    <w:p>
+      <w:pPr>
         <w:pStyle w:val="Heading2"/>
       </w:pPr>
+      <w:r>
+        <w:br w:type="column"/>
+      </w:r>
       <w:r>
         <w:t>Dispute Prediction Workflow</w:t>
       </w:r>
@@ -1586,7 +1661,7 @@
         </w:sectPr>
       </w:pPr>
       <w:r>
-        <w:t>While a job is active, the backend continuously extracts a feature vector from off-chain interaction data – agreed budget, projected versus actual timeline, communication frequency, and revision-request counts – and feeds it to a logistic regression classifier. The model outputs a continuous risk score representing dispute likelihood. If the score remains below a configured threshold, the job proceeds normally under standard escrow. If the threshold is met or exceeded, the system flags the job as high-risk and sends a permissioned cooldown trigger to the escrow contract, which pauses fund release and opens a mandatory mediation window before the relationship can proceed further. Algorithm 3 formalizes this decision procedure, and Fig. 3 visualizes the same risk-threshold and mediation flow.</w:t>
+        <w:t>While a job is active, the backend continuously extracts a feature vector from off-chain interaction data – agreed budget, projected versus actual timeline, communication frequency, and revision-request counts – and feeds it to a logistic regression classifier. The model outputs a continuous risk score representing dispute likelihood. If the score remains below a configured threshold, the job proceeds normally under standard escrow. If the threshold is met or exceeded, the system flags the job as high-risk and sends a permissioned cooldown trigger to the escrow contract, which pauses fund release and opens a mandatory mediation window before the relationship</w:t>
       </w:r>
     </w:p>
     <w:p>
@@ -1598,7 +1673,7 @@
       <w:r>
         <w:drawing>
           <wp:inline distT="0" distB="0" distL="0" distR="0">
-            <wp:extent cx="4318000" cy="3223295"/>
+            <wp:extent cx="4546600" cy="3393940"/>
             <wp:docPr id="2" name="Picture 2"/>
             <wp:cNvGraphicFramePr>
               <a:graphicFrameLocks xmlns:a="http://purl.oclc.org/ooxml/drawingml/main" noChangeAspect="1"/>
@@ -1619,7 +1694,7 @@
                   <pic:spPr>
                     <a:xfrm>
                       <a:off x="0" y="0"/>
-                      <a:ext cx="4318000" cy="3223295"/>
+                      <a:ext cx="4546600" cy="3393940"/>
                     </a:xfrm>
                     <a:prstGeom prst="rect">
                       <a:avLst/>
@@ -1637,7 +1712,7 @@
         <w:pStyle w:val="figurecaption"/>
         <w:jc w:val="center"/>
         <w:sectPr>
-          <w:type w:val="continuous"/>
+          <w:type w:val="nextPage"/>
           <w:pgSz w:w="595.30pt" w:h="841.90pt" w:code="9"/>
           <w:pgMar w:top="54pt" w:right="45.35pt" w:bottom="72pt" w:left="45.35pt" w:header="36pt" w:footer="36pt" w:gutter="0pt"/>
           <w:cols w:space="18pt"/>
@@ -2304,8 +2379,20 @@
     </w:p>
     <w:p>
       <w:pPr>
+        <w:pStyle w:val="BodyText"/>
+        <w:ind w:firstLine="0pt"/>
+      </w:pPr>
+      <w:r>
+        <w:t>can proceed further. Algorithm 3 formalizes this decision procedure, and Fig. 3 visualizes the same risk-threshold and mediation flow.</w:t>
+      </w:r>
+    </w:p>
+    <w:p>
+      <w:pPr>
         <w:spacing w:after="0pt" w:line="6pt" w:lineRule="exact"/>
       </w:pPr>
+      <w:r>
+        <w:br w:type="column"/>
+      </w:r>
     </w:p>
     <w:tbl>
       <w:tblPr>
@@ -2900,9 +2987,16 @@
     <w:p>
       <w:pPr>
         <w:pStyle w:val="BodyText"/>
-      </w:pPr>
-      <w:r>
-        <w:t>The entire lifecycle starts when a customer uses the lock function in the escrow contract to deposit the project budget and record the job parameters (budget, duration, and necessary skills) as an immutable on-chain state. Algorithm 4 gives the complete step-by-step lifecycle, and Fig. 4 provides the corresponding end-to-end flowchart. In order to receive the matching Soulbound Token, a potential freelancer without the necessary credentials completes the AI skill-verification process mentioned above. In order to bid, the freelancer uses the pre-compiled Circom circuit to build a zero-knowledge proof off-chain. Using private behavioural metrics as witnesses, they produce a brief Groth16 proof that their overall reputation surpasses the client’s minimum threshold. The Reputation Registry contract’s verification function uses the stored verification key to verify this proof, which is submitted with the bid, on-chain without disclosing the underlying behavioural data.</w:t>
+        <w:sectPr>
+          <w:type w:val="continuous"/>
+          <w:pgSz w:w="595.30pt" w:h="841.90pt" w:code="9"/>
+          <w:pgMar w:top="54pt" w:right="45.35pt" w:bottom="72pt" w:left="45.35pt" w:header="36pt" w:footer="36pt" w:gutter="0pt"/>
+          <w:cols w:num="2" w:space="18pt"/>
+          <w:docGrid w:linePitch="360"/>
+        </w:sectPr>
+      </w:pPr>
+      <w:r>
+        <w:t>The entire lifecycle starts when a customer uses the lock function in the escrow contract to deposit the project budget and record the job parameters (budget, duration, and necessary skills) as an immutable on-chain state. Algorithm 4 gives the complete step-by-step lifecycle, and Fig. 4 provides the corresponding end-to-end flowchart. In order to receive the matching Soulbound Token, a potential freelancer without the</w:t>
       </w:r>
     </w:p>
     <w:p>
@@ -2914,7 +3008,7 @@
       <w:r>
         <w:drawing>
           <wp:inline distT="0" distB="0" distL="0" distR="0">
-            <wp:extent cx="2286000" cy="3649042"/>
+            <wp:extent cx="3175000" cy="5068114"/>
             <wp:docPr id="3" name="Picture 3"/>
             <wp:cNvGraphicFramePr>
               <a:graphicFrameLocks xmlns:a="http://purl.oclc.org/ooxml/drawingml/main" noChangeAspect="1"/>
@@ -2935,7 +3029,7 @@
                   <pic:spPr>
                     <a:xfrm>
                       <a:off x="0" y="0"/>
-                      <a:ext cx="2286000" cy="3649042"/>
+                      <a:ext cx="3175000" cy="5068114"/>
                     </a:xfrm>
                     <a:prstGeom prst="rect">
                       <a:avLst/>
@@ -2952,6 +3046,13 @@
       <w:pPr>
         <w:pStyle w:val="figurecaption"/>
         <w:jc w:val="center"/>
+        <w:sectPr>
+          <w:type w:val="nextPage"/>
+          <w:pgSz w:w="595.30pt" w:h="841.90pt" w:code="9"/>
+          <w:pgMar w:top="54pt" w:right="45.35pt" w:bottom="72pt" w:left="45.35pt" w:header="36pt" w:footer="36pt" w:gutter="0pt"/>
+          <w:cols w:space="18pt"/>
+          <w:docGrid w:linePitch="360"/>
+        </w:sectPr>
       </w:pPr>
       <w:r>
         <w:t>Dispute prediction workflow.</w:t>
@@ -2960,9 +3061,10 @@
     <w:p>
       <w:pPr>
         <w:pStyle w:val="BodyText"/>
-      </w:pPr>
-      <w:r>
-        <w:t>The task is moved from a bidding state to an active state and its parameters are locked against unilateral modification after both parties cryptographically sign the job-acceptance transaction upon selection. The backend converts interaction metadata, such as communication frequency, milestone adherence, and budget deviation, into a real-time feature vector as the project moves forward. The dispute-prediction classifier discussed above receives this vector, calculates a risk score, and flags the work as high-risk if the score meets or surpasses the configured threshold. This vector is then fed straight into the mediation trigger that is explained next.</w:t>
+        <w:ind w:firstLine="0pt"/>
+      </w:pPr>
+      <w:r>
+        <w:t>necessary credentials completes the AI skill-verification process mentioned above. In order to bid, the freelancer uses the pre-compiled Circom circuit to build a zero-knowledge proof off-chain. Using private behavioural metrics as witnesses, they produce a brief Groth16 proof that their overall reputation surpasses the client’s minimum threshold. The Reputation Registry contract’s verification function uses the stored verification key to verify this proof, which is submitted with the bid, on-chain without disclosing the underlying behavioural data.</w:t>
       </w:r>
     </w:p>
     <w:p>
@@ -2970,7 +3072,93 @@
         <w:pStyle w:val="BodyText"/>
       </w:pPr>
       <w:r>
+        <w:t>The task is moved from a bidding state to an active state and its parameters are locked against unilateral modification after both parties cryptographically sign the job-acceptance transaction upon selection. The backend converts interaction metadata, such as communication frequency, milestone adherence, and budget deviation, into a real-time feature vector as the project moves forward. The dispute-prediction classifier discussed above receives this vector, calculates a risk score,</w:t>
+      </w:r>
+    </w:p>
+    <w:p>
+      <w:pPr>
+        <w:pStyle w:val="BodyText"/>
+        <w:ind w:firstLine="0pt"/>
+      </w:pPr>
+      <w:r>
+        <w:br w:type="column"/>
+      </w:r>
+      <w:r>
+        <w:t>and flags the work as high-risk if the score meets or surpasses the configured threshold. This vector is then fed straight into the mediation trigger that is explained next.</w:t>
+      </w:r>
+    </w:p>
+    <w:p>
+      <w:pPr>
+        <w:pStyle w:val="BodyText"/>
+        <w:sectPr>
+          <w:type w:val="continuous"/>
+          <w:pgSz w:w="595.30pt" w:h="841.90pt" w:code="9"/>
+          <w:pgMar w:top="54pt" w:right="45.35pt" w:bottom="72pt" w:left="45.35pt" w:header="36pt" w:footer="36pt" w:gutter="0pt"/>
+          <w:cols w:num="2" w:space="18pt"/>
+          <w:docGrid w:linePitch="360"/>
+        </w:sectPr>
+      </w:pPr>
+      <w:r>
         <w:t>When a high-risk flag is raised, the backend uses a permissioned relayer to initiate the escrow contract’s mediation function. This stops the transfer of funds and opens a mandatory mediation window before the job can continue. In the absence of a high-risk indication, the client initiates the escrow release function, which verifies completion criteria and sends locked cash straight to the freelancer’s wallet after the freelancer provides final deliverables. The lifecycle ends with an asynchronous update: the Graph Analysis Engine adjusts the freelancer’s PageRank-based authority score in the Skill Graph to reflect the freshly finished work, and completion data is recorded off-chain for future classifier training and evidence generation.</w:t>
+      </w:r>
+    </w:p>
+    <w:p>
+      <w:pPr>
+        <w:keepNext/>
+        <w:spacing w:before="6pt" w:after="0pt"/>
+        <w:jc w:val="center"/>
+      </w:pPr>
+      <w:r>
+        <w:drawing>
+          <wp:inline distT="0" distB="0" distL="0" distR="0">
+            <wp:extent cx="5588000" cy="7491604"/>
+            <wp:docPr id="4" name="Picture 4"/>
+            <wp:cNvGraphicFramePr>
+              <a:graphicFrameLocks xmlns:a="http://purl.oclc.org/ooxml/drawingml/main" noChangeAspect="1"/>
+            </wp:cNvGraphicFramePr>
+            <a:graphic xmlns:a="http://purl.oclc.org/ooxml/drawingml/main">
+              <a:graphicData uri="http://purl.oclc.org/ooxml/drawingml/picture">
+                <pic:pic xmlns:pic="http://purl.oclc.org/ooxml/drawingml/picture">
+                  <pic:nvPicPr>
+                    <pic:cNvPr id="4" name="image4.png"/>
+                    <pic:cNvPicPr/>
+                  </pic:nvPicPr>
+                  <pic:blipFill>
+                    <a:blip r:embed="rIdImg4"/>
+                    <a:stretch>
+                      <a:fillRect/>
+                    </a:stretch>
+                  </pic:blipFill>
+                  <pic:spPr>
+                    <a:xfrm>
+                      <a:off x="0" y="0"/>
+                      <a:ext cx="5588000" cy="7491604"/>
+                    </a:xfrm>
+                    <a:prstGeom prst="rect">
+                      <a:avLst/>
+                    </a:prstGeom>
+                  </pic:spPr>
+                </pic:pic>
+              </a:graphicData>
+            </a:graphic>
+          </wp:inline>
+        </w:drawing>
+      </w:r>
+    </w:p>
+    <w:p>
+      <w:pPr>
+        <w:pStyle w:val="figurecaption"/>
+        <w:jc w:val="center"/>
+        <w:sectPr>
+          <w:type w:val="nextPage"/>
+          <w:pgSz w:w="595.30pt" w:h="841.90pt" w:code="9"/>
+          <w:pgMar w:top="54pt" w:right="45.35pt" w:bottom="72pt" w:left="45.35pt" w:header="36pt" w:footer="36pt" w:gutter="0pt"/>
+          <w:cols w:space="18pt"/>
+          <w:docGrid w:linePitch="360"/>
+        </w:sectPr>
+      </w:pPr>
+      <w:r>
+        <w:t>End-to-end job lifecycle flowchart.</w:t>
       </w:r>
     </w:p>
     <w:p>
@@ -3883,73 +4071,7 @@
     <w:p>
       <w:pPr>
         <w:spacing w:after="0pt" w:line="6pt" w:lineRule="exact"/>
-        <w:sectPr>
-          <w:type w:val="continuous"/>
-          <w:pgSz w:w="595.30pt" w:h="841.90pt" w:code="9"/>
-          <w:pgMar w:top="54pt" w:right="45.35pt" w:bottom="72pt" w:left="45.35pt" w:header="36pt" w:footer="36pt" w:gutter="0pt"/>
-          <w:cols w:num="2" w:space="18pt"/>
-          <w:docGrid w:linePitch="360"/>
-        </w:sectPr>
-      </w:pPr>
-    </w:p>
-    <w:p>
-      <w:pPr>
-        <w:keepNext/>
-        <w:spacing w:before="6pt" w:after="0pt"/>
-        <w:jc w:val="center"/>
-      </w:pPr>
-      <w:r>
-        <w:drawing>
-          <wp:inline distT="0" distB="0" distL="0" distR="0">
-            <wp:extent cx="4826000" cy="6470021"/>
-            <wp:docPr id="4" name="Picture 4"/>
-            <wp:cNvGraphicFramePr>
-              <a:graphicFrameLocks xmlns:a="http://purl.oclc.org/ooxml/drawingml/main" noChangeAspect="1"/>
-            </wp:cNvGraphicFramePr>
-            <a:graphic xmlns:a="http://purl.oclc.org/ooxml/drawingml/main">
-              <a:graphicData uri="http://purl.oclc.org/ooxml/drawingml/picture">
-                <pic:pic xmlns:pic="http://purl.oclc.org/ooxml/drawingml/picture">
-                  <pic:nvPicPr>
-                    <pic:cNvPr id="4" name="image4.png"/>
-                    <pic:cNvPicPr/>
-                  </pic:nvPicPr>
-                  <pic:blipFill>
-                    <a:blip r:embed="rIdImg4"/>
-                    <a:stretch>
-                      <a:fillRect/>
-                    </a:stretch>
-                  </pic:blipFill>
-                  <pic:spPr>
-                    <a:xfrm>
-                      <a:off x="0" y="0"/>
-                      <a:ext cx="4826000" cy="6470021"/>
-                    </a:xfrm>
-                    <a:prstGeom prst="rect">
-                      <a:avLst/>
-                    </a:prstGeom>
-                  </pic:spPr>
-                </pic:pic>
-              </a:graphicData>
-            </a:graphic>
-          </wp:inline>
-        </w:drawing>
-      </w:r>
-    </w:p>
-    <w:p>
-      <w:pPr>
-        <w:pStyle w:val="figurecaption"/>
-        <w:jc w:val="center"/>
-        <w:sectPr>
-          <w:type w:val="continuous"/>
-          <w:pgSz w:w="595.30pt" w:h="841.90pt" w:code="9"/>
-          <w:pgMar w:top="54pt" w:right="45.35pt" w:bottom="72pt" w:left="45.35pt" w:header="36pt" w:footer="36pt" w:gutter="0pt"/>
-          <w:cols w:space="18pt"/>
-          <w:docGrid w:linePitch="360"/>
-        </w:sectPr>
-      </w:pPr>
-      <w:r>
-        <w:t>End-to-end job lifecycle flowchart.</w:t>
-      </w:r>
+      </w:pPr>
     </w:p>
     <w:p>
       <w:pPr>
@@ -3980,14 +4102,18 @@
         <w:pStyle w:val="BodyText"/>
       </w:pPr>
       <w:r>
-        <w:t>The prototype is evaluated using five metrics. The computational cost of each state-changing contract call (credential minting, escrow lock/release, proof verification, mediation trigger) is measured by gas cost. Proof-generation time quantifies how long it takes to compute Groth16 witnesses off-chain and prove for the reputation circuit. The gas used to validate a given proof on-chain is measured by the proof-verification cost. Wall-clock time for a single job-lifecycle cycle is measured by end-to-end latency. A test suite spanning valid-path execution and rejection of invalid or adversarial inputs (e.g., unauthorised minting attempts, malformed proofs) is used to evaluate functional correctness.</w:t>
+        <w:t>The prototype is evaluated using five metrics. The computational cost of each state-changing contract call (credential minting, escrow lock/release, proof verification, mediation trigger) is measured by gas cost. Proof-generation time quantifies how long it takes to compute Groth16 witnesses off-chain and prove for the reputation circuit. The gas used to validate a given proof on-chain is measured by the proof-verification cost. Wall-clock time for a single job-lifecycle</w:t>
       </w:r>
     </w:p>
     <w:p>
       <w:pPr>
         <w:pStyle w:val="tablehead"/>
         <w:keepNext/>
-      </w:pPr>
+        <w:spacing w:before="0pt"/>
+      </w:pPr>
+      <w:r>
+        <w:br w:type="column"/>
+      </w:r>
       <w:r>
         <w:t>Measured Performance Results</w:t>
       </w:r>
@@ -4290,6 +4416,15 @@
     </w:p>
     <w:p>
       <w:pPr>
+        <w:pStyle w:val="BodyText"/>
+        <w:ind w:firstLine="0pt"/>
+      </w:pPr>
+      <w:r>
+        <w:t>cycle is measured by end-to-end latency. A test suite spanning valid-path execution and rejection of invalid or adversarial inputs (e.g., unauthorised minting attempts, malformed proofs) is used to evaluate functional correctness.</w:t>
+      </w:r>
+    </w:p>
+    <w:p>
+      <w:pPr>
         <w:pStyle w:val="Heading2"/>
       </w:pPr>
       <w:r>
@@ -4341,6 +4476,9 @@
         <w:pStyle w:val="Heading1"/>
       </w:pPr>
       <w:r>
+        <w:br w:type="column"/>
+      </w:r>
+      <w:r>
         <w:t>Conclusion</w:t>
       </w:r>
     </w:p>
@@ -4371,8 +4509,8 @@
     <w:p>
       <w:pPr>
         <w:pStyle w:val="references"/>
+        <w:spacing w:after="0pt" w:line="8.8pt" w:lineRule="exact"/>
         <w:ind w:start="17.70pt" w:hanging="17.70pt"/>
-        <w:jc w:val="start"/>
       </w:pPr>
       <w:r>
         <w:t xml:space="preserve">S. Reddy and D. S. Kushwaha, “Framework for Privacy-Preserving Credential Issuance and Verification System Using Soulbound Token,” </w:t>
@@ -4391,8 +4529,8 @@
     <w:p>
       <w:pPr>
         <w:pStyle w:val="references"/>
+        <w:spacing w:after="0pt" w:line="8.8pt" w:lineRule="exact"/>
         <w:ind w:start="17.70pt" w:hanging="17.70pt"/>
-        <w:jc w:val="start"/>
       </w:pPr>
       <w:r>
         <w:t xml:space="preserve">D. M. F. Rehtaliani, “Blockchain-Based Credential Models: Enhancing Verification With Soulbound Tokens,” </w:t>
@@ -4411,8 +4549,8 @@
     <w:p>
       <w:pPr>
         <w:pStyle w:val="references"/>
+        <w:spacing w:after="0pt" w:line="8.8pt" w:lineRule="exact"/>
         <w:ind w:start="17.70pt" w:hanging="17.70pt"/>
-        <w:jc w:val="start"/>
       </w:pPr>
       <w:r>
         <w:t xml:space="preserve">R. Pericàs-Gornals, M. Mut-Puigserver, M. M. Payeras-Capellá, M. Á. Cabot-Nadal, and J. Ramis-Bibiloni, “Digital Credentials Management System Using Rejectable Soulbound Tokens,” </w:t>
@@ -4431,8 +4569,8 @@
     <w:p>
       <w:pPr>
         <w:pStyle w:val="references"/>
+        <w:spacing w:after="0pt" w:line="8.8pt" w:lineRule="exact"/>
         <w:ind w:start="17.70pt" w:hanging="17.70pt"/>
-        <w:jc w:val="start"/>
       </w:pPr>
       <w:r>
         <w:t xml:space="preserve">J. A. Berrios Moya, J. Ayoade, and M. A. Uddin, “A Zero-Knowledge Proof-Enabled Blockchain-Based Academic Record Verification System (ZKBAR-V),” </w:t>
@@ -4451,8 +4589,8 @@
     <w:p>
       <w:pPr>
         <w:pStyle w:val="references"/>
+        <w:spacing w:after="0pt" w:line="8.8pt" w:lineRule="exact"/>
         <w:ind w:start="17.70pt" w:hanging="17.70pt"/>
-        <w:jc w:val="start"/>
       </w:pPr>
       <w:r>
         <w:t xml:space="preserve">M. Al Hemairy, M. Abu Talib, A. Khalil, A. Zulfiqar, and T. Mohamed, “Blockchain-Based Framework for Validation and Authentication of Academic Credentials,” </w:t>
@@ -4471,8 +4609,8 @@
     <w:p>
       <w:pPr>
         <w:pStyle w:val="references"/>
+        <w:spacing w:after="0pt" w:line="8.8pt" w:lineRule="exact"/>
         <w:ind w:start="17.70pt" w:hanging="17.70pt"/>
-        <w:jc w:val="start"/>
       </w:pPr>
       <w:r>
         <w:t xml:space="preserve">G. Caldarelli, “Can Artificial Intelligence Solve the Blockchain Oracle Problem?,” </w:t>
@@ -4491,8 +4629,8 @@
     <w:p>
       <w:pPr>
         <w:pStyle w:val="references"/>
+        <w:spacing w:after="0pt" w:line="8.8pt" w:lineRule="exact"/>
         <w:ind w:start="17.70pt" w:hanging="17.70pt"/>
-        <w:jc w:val="start"/>
       </w:pPr>
       <w:r>
         <w:t xml:space="preserve">H. Yuan, “A Scalable Privacy-Preserving Decentralized Identity Framework Based on ZKPs,” </w:t>
@@ -4511,8 +4649,8 @@
     <w:p>
       <w:pPr>
         <w:pStyle w:val="references"/>
+        <w:spacing w:after="0pt" w:line="8.8pt" w:lineRule="exact"/>
         <w:ind w:start="17.70pt" w:hanging="17.70pt"/>
-        <w:jc w:val="start"/>
       </w:pPr>
       <w:r>
         <w:t xml:space="preserve">R. Lavin, X. Liu, H. Mohanty, L. Norman, G. Zaarour, and B. Krishnamachari, “A Survey on the Applications of Zero-Knowledge Proofs,” </w:t>
@@ -4531,8 +4669,8 @@
     <w:p>
       <w:pPr>
         <w:pStyle w:val="references"/>
+        <w:spacing w:after="0pt" w:line="8.8pt" w:lineRule="exact"/>
         <w:ind w:start="17.70pt" w:hanging="17.70pt"/>
-        <w:jc w:val="start"/>
       </w:pPr>
       <w:r>
         <w:t xml:space="preserve">R. Shashidhara, R. Chirakarotu Nair, and P. Kumar Panakalapati, “Promise of Zero-Knowledge Proofs (ZKPs) for Blockchain Privacy and Security: Opportunities, Challenges, and Future Directions,” </w:t>
@@ -4551,8 +4689,8 @@
     <w:p>
       <w:pPr>
         <w:pStyle w:val="references"/>
+        <w:spacing w:after="0pt" w:line="8.8pt" w:lineRule="exact"/>
         <w:ind w:start="17.70pt" w:hanging="17.70pt"/>
-        <w:jc w:val="start"/>
       </w:pPr>
       <w:r>
         <w:t xml:space="preserve">C. Udokwu, “Zero Knowledge Proof Solutions to Linkability Problems in Blockchain-Based Collaboration Systems,” </w:t>
@@ -4571,8 +4709,8 @@
     <w:p>
       <w:pPr>
         <w:pStyle w:val="references"/>
+        <w:spacing w:after="0pt" w:line="8.8pt" w:lineRule="exact"/>
         <w:ind w:start="17.70pt" w:hanging="17.70pt"/>
-        <w:jc w:val="start"/>
       </w:pPr>
       <w:r>
         <w:t xml:space="preserve">O. Hasan, L. Brunie, and E. Bertino, “Privacy Preserving Reputation Systems Based on Blockchain and Other Cryptographic Building Blocks: A Survey,” </w:t>
@@ -4591,9 +4729,12 @@
     <w:p>
       <w:pPr>
         <w:pStyle w:val="references"/>
+        <w:spacing w:after="0pt" w:line="8.8pt" w:lineRule="exact"/>
         <w:ind w:start="17.70pt" w:hanging="17.70pt"/>
-        <w:jc w:val="start"/>
-      </w:pPr>
+      </w:pPr>
+      <w:r>
+        <w:br w:type="column"/>
+      </w:r>
       <w:r>
         <w:t xml:space="preserve">M. A. Bouchiha, “Advancing Blockchain-Based Reputation Systems (DARS): ZK-SNARKs for Anonymous Reputation,” Ph.D. dissertation, </w:t>
       </w:r>
@@ -4611,8 +4752,8 @@
     <w:p>
       <w:pPr>
         <w:pStyle w:val="references"/>
+        <w:spacing w:after="0pt" w:line="8.8pt" w:lineRule="exact"/>
         <w:ind w:start="17.70pt" w:hanging="17.70pt"/>
-        <w:jc w:val="start"/>
       </w:pPr>
       <w:r>
         <w:t xml:space="preserve">A. S. Almasoud, F. K. Hussain, and O. K. Hussain, “Smart Contracts for Blockchain-Based Reputation Systems: A Systematic Literature Review,” </w:t>
@@ -4631,8 +4772,8 @@
     <w:p>
       <w:pPr>
         <w:pStyle w:val="references"/>
+        <w:spacing w:after="0pt" w:line="8.8pt" w:lineRule="exact"/>
         <w:ind w:start="17.70pt" w:hanging="17.70pt"/>
-        <w:jc w:val="start"/>
       </w:pPr>
       <w:r>
         <w:t xml:space="preserve">P. Zhang, Y. Yuan, J. Song, </w:t>
@@ -4661,8 +4802,8 @@
     <w:p>
       <w:pPr>
         <w:pStyle w:val="references"/>
+        <w:spacing w:after="0pt" w:line="8.8pt" w:lineRule="exact"/>
         <w:ind w:start="17.70pt" w:hanging="17.70pt"/>
-        <w:jc w:val="start"/>
       </w:pPr>
       <w:r>
         <w:t xml:space="preserve">S. Wang, C. Huang, J. Li, Y. Yuan, and F.-Y. Wang, “Decentralized Construction of Knowledge Graphs for Deep Recommender Systems Based on Blockchain-Powered Smart Contracts,” </w:t>
@@ -4681,8 +4822,8 @@
     <w:p>
       <w:pPr>
         <w:pStyle w:val="references"/>
+        <w:spacing w:after="0pt" w:line="8.8pt" w:lineRule="exact"/>
         <w:ind w:start="17.70pt" w:hanging="17.70pt"/>
-        <w:jc w:val="start"/>
       </w:pPr>
       <w:r>
         <w:t xml:space="preserve">M.-T. Nguyen, T.-D. Trinh, and V.-B. Pham, “A Reputation Scoring Framework for Lending Protocols Using the PageRank Algorithm,” in </w:t>
@@ -4701,8 +4842,8 @@
     <w:p>
       <w:pPr>
         <w:pStyle w:val="references"/>
+        <w:spacing w:after="0pt" w:line="8.8pt" w:lineRule="exact"/>
         <w:ind w:start="17.70pt" w:hanging="17.70pt"/>
-        <w:jc w:val="start"/>
       </w:pPr>
       <w:r>
         <w:t xml:space="preserve">S. Imig, “Trustworthiness and PageRank on the Ethereum Blockchain: Technical Report,” </w:t>
@@ -4721,8 +4862,8 @@
     <w:p>
       <w:pPr>
         <w:pStyle w:val="references"/>
+        <w:spacing w:after="0pt" w:line="8.8pt" w:lineRule="exact"/>
         <w:ind w:start="17.70pt" w:hanging="17.70pt"/>
-        <w:jc w:val="start"/>
       </w:pPr>
       <w:r>
         <w:t xml:space="preserve">Q. Liu, Q. Huang, F. Fan, H. Wu, and X. Tang, “Detecting Sybil Addresses in Blockchain Airdrops: A Subgraph-Based Feature Propagation and Fusion Approach,” </w:t>
@@ -4741,8 +4882,8 @@
     <w:p>
       <w:pPr>
         <w:pStyle w:val="references"/>
+        <w:spacing w:after="0pt" w:line="8.8pt" w:lineRule="exact"/>
         <w:ind w:start="17.70pt" w:hanging="17.70pt"/>
-        <w:jc w:val="start"/>
       </w:pPr>
       <w:r>
         <w:t xml:space="preserve">Y. Wang and M. Tan, “Defense Against Sybil Attack in Blockchain Based on Improved Consensus Algorithm,” in </w:t>
@@ -4761,8 +4902,8 @@
     <w:p>
       <w:pPr>
         <w:pStyle w:val="references"/>
+        <w:spacing w:after="0pt" w:line="8.8pt" w:lineRule="exact"/>
         <w:ind w:start="17.70pt" w:hanging="17.70pt"/>
-        <w:jc w:val="start"/>
       </w:pPr>
       <w:r>
         <w:t xml:space="preserve">P. Deshmukh, S. T. Kalwaghe, A. Appa, and A. Pawar, “Decentralised Freelancing Using Ethereum Blockchain,” in </w:t>
@@ -4781,8 +4922,8 @@
     <w:p>
       <w:pPr>
         <w:pStyle w:val="references"/>
+        <w:spacing w:after="0pt" w:line="8.8pt" w:lineRule="exact"/>
         <w:ind w:start="17.70pt" w:hanging="17.70pt"/>
-        <w:jc w:val="start"/>
       </w:pPr>
       <w:r>
         <w:t xml:space="preserve">A. Asgaonkar and B. Krishnamachari, “Solving the Buyer and Seller’s Dilemma: A Dual-Deposit Escrow Smart Contract for Provably Cheat-Proof Delivery and Payment for a Digital Good without a Trusted Mediator,” in </w:t>
@@ -4801,8 +4942,8 @@
     <w:p>
       <w:pPr>
         <w:pStyle w:val="references"/>
+        <w:spacing w:after="0pt" w:line="8.8pt" w:lineRule="exact"/>
         <w:ind w:start="17.70pt" w:hanging="17.70pt"/>
-        <w:jc w:val="start"/>
       </w:pPr>
       <w:r>
         <w:t xml:space="preserve">S. N. Khan, F. Loukil, C. Ghedira-Guegan, E. Benkhelifa, and A. Bani-Hani, “Blockchain Smart Contracts: Applications, Challenges, and Future Trends,” </w:t>
@@ -4821,8 +4962,8 @@
     <w:p>
       <w:pPr>
         <w:pStyle w:val="references"/>
+        <w:spacing w:after="0pt" w:line="8.8pt" w:lineRule="exact"/>
         <w:ind w:start="17.70pt" w:hanging="17.70pt"/>
-        <w:jc w:val="start"/>
       </w:pPr>
       <w:r>
         <w:t xml:space="preserve">J. Bonneau, A. Miller, J. Clark, A. Narayanan, J. A. Kroll, and E. W. Felten, “SoK: Research Perspectives and Challenges for Bitcoin and Cryptocurrencies,” in </w:t>
@@ -4841,8 +4982,8 @@
     <w:p>
       <w:pPr>
         <w:pStyle w:val="references"/>
+        <w:spacing w:after="0pt" w:line="8.8pt" w:lineRule="exact"/>
         <w:ind w:start="17.70pt" w:hanging="17.70pt"/>
-        <w:jc w:val="start"/>
       </w:pPr>
       <w:r>
         <w:t xml:space="preserve">G. Zyskind, O. Nathan, and A. Pentland, “Decentralizing Privacy: Using Blockchain to Protect Personal Data,” in </w:t>
@@ -4861,8 +5002,8 @@
     <w:p>
       <w:pPr>
         <w:pStyle w:val="references"/>
+        <w:spacing w:after="0pt" w:line="8.8pt" w:lineRule="exact"/>
         <w:ind w:start="17.70pt" w:hanging="17.70pt"/>
-        <w:jc w:val="start"/>
       </w:pPr>
       <w:r>
         <w:t xml:space="preserve">I. Miers, C. Garman, M. Green, and A. D. Rubin, “Zerocoin: Anonymous Distributed E-Cash from Bitcoin,” in </w:t>
@@ -4881,8 +5022,8 @@
     <w:p>
       <w:pPr>
         <w:pStyle w:val="references"/>
+        <w:spacing w:after="0pt" w:line="8.8pt" w:lineRule="exact"/>
         <w:ind w:start="17.70pt" w:hanging="17.70pt"/>
-        <w:jc w:val="start"/>
       </w:pPr>
       <w:r>
         <w:t xml:space="preserve">A. E. Kosba, A. Miller, E. Shi, Z. Wen, and C. Papamanthou, “Hawk: The Blockchain Model of Cryptography and Privacy-Preserving Smart Contracts,” in </w:t>
@@ -4901,8 +5042,8 @@
     <w:p>
       <w:pPr>
         <w:pStyle w:val="references"/>
+        <w:spacing w:after="0pt" w:line="8.8pt" w:lineRule="exact"/>
         <w:ind w:start="17.70pt" w:hanging="17.70pt"/>
-        <w:jc w:val="start"/>
       </w:pPr>
       <w:r>
         <w:t xml:space="preserve">J. Groth, “On the Size of Pairing-Based Non-interactive Arguments,” in </w:t>
@@ -4921,11 +5062,28 @@
     <w:p>
       <w:pPr>
         <w:pStyle w:val="references"/>
+        <w:spacing w:after="0pt" w:line="8.8pt" w:lineRule="exact"/>
         <w:ind w:start="17.70pt" w:hanging="17.70pt"/>
-        <w:jc w:val="start"/>
-      </w:pPr>
-      <w:r>
-        <w:t xml:space="preserve">A. Sonnino, M. Al-Bassam, S. Bano, S. Meiklejohn, and G. Danezis, “Coconut: Threshold Issuance Selective Disclosure Credentials with Applications to Distributed Ledgers,” in </w:t>
+      </w:pPr>
+      <w:r>
+        <w:t>A. Sonnino, M. Al-Bassam, S. Bano, S. Meiklejohn, and G. Danezis, “Coconut: Threshold Issuance Selective Disclosure Credentials with</w:t>
+      </w:r>
+    </w:p>
+    <w:p>
+      <w:pPr>
+        <w:pStyle w:val="references"/>
+        <w:numPr>
+          <w:ilvl w:val="0"/>
+          <w:numId w:val="0"/>
+        </w:numPr>
+        <w:spacing w:after="0pt" w:line="8.8pt" w:lineRule="exact"/>
+        <w:ind w:start="17.70pt" w:firstLine="0pt"/>
+      </w:pPr>
+      <w:r>
+        <w:br w:type="column"/>
+      </w:r>
+      <w:r>
+        <w:t xml:space="preserve">Applications to Distributed Ledgers,” in </w:t>
       </w:r>
       <w:r>
         <w:rPr>
@@ -4941,8 +5099,8 @@
     <w:p>
       <w:pPr>
         <w:pStyle w:val="references"/>
+        <w:spacing w:after="0pt" w:line="8.8pt" w:lineRule="exact"/>
         <w:ind w:start="17.70pt" w:hanging="17.70pt"/>
-        <w:jc w:val="start"/>
       </w:pPr>
       <w:r>
         <w:t xml:space="preserve">W. Tang, S. S. Mukherjee, S. Park, C. Chenli, H. Oh, J. Kim, and T. Jung, “GrAC: Graph-Based Anonymous Credentials from Identity Graphs on Blockchain,” in </w:t>
@@ -4961,8 +5119,8 @@
     <w:p>
       <w:pPr>
         <w:pStyle w:val="references"/>
+        <w:spacing w:after="0pt" w:line="8.8pt" w:lineRule="exact"/>
         <w:ind w:start="17.70pt" w:hanging="17.70pt"/>
-        <w:jc w:val="start"/>
       </w:pPr>
       <w:r>
         <w:t xml:space="preserve">O. Ersoy, Z. A. Genç, Z. Erkin, and M. Conti, “Practical Exchange for Unique Digital Goods,” in </w:t>
@@ -4979,7 +5137,7 @@
       </w:r>
     </w:p>
     <w:sectPr>
-      <w:type w:val="continuous"/>
+      <w:type w:val="nextPage"/>
       <w:pgSz w:w="595.30pt" w:h="841.90pt" w:code="9"/>
       <w:pgMar w:top="54pt" w:right="45.35pt" w:bottom="72pt" w:left="45.35pt" w:header="36pt" w:footer="36pt" w:gutter="0pt"/>
       <w:cols w:num="2" w:space="18pt"/>

</xml_diff>